<commit_message>
ANY , ALL , EXISTS
</commit_message>
<xml_diff>
--- a/notes/All theory - Intermediate.docx
+++ b/notes/All theory - Intermediate.docx
@@ -63,21 +63,13 @@
     </w:p>
     <w:p>
       <w:r>
-        <w:t xml:space="preserve">The inner query runs first, produces a result, and that </w:t>
-      </w:r>
-      <w:proofErr w:type="spellStart"/>
-      <w:r>
-        <w:t>r</w:t>
+        <w:t>The inner query runs first, produces a result, and that r</w:t>
       </w:r>
       <w:r>
         <w:t>S</w:t>
       </w:r>
       <w:r>
-        <w:t>esult</w:t>
-      </w:r>
-      <w:proofErr w:type="spellEnd"/>
-      <w:r>
-        <w:t xml:space="preserve"> is then used by the outer query to complete its job.​</w:t>
+        <w:t>esult is then used by the outer query to complete its job.​</w:t>
       </w:r>
     </w:p>
     <w:p>
@@ -345,15 +337,7 @@
     </w:p>
     <w:p>
       <w:r>
-        <w:t>Without aliases, SQL would not know which </w:t>
-      </w:r>
-      <w:proofErr w:type="spellStart"/>
-      <w:r>
-        <w:t>department_id</w:t>
-      </w:r>
-      <w:proofErr w:type="spellEnd"/>
-      <w:r>
-        <w:t> belongs to the outer row and which belongs to the inner aggregation.</w:t>
+        <w:t>Without aliases, SQL would not know which department_id belongs to the outer row and which belongs to the inner aggregation.</w:t>
       </w:r>
     </w:p>
     <w:p>
@@ -501,15 +485,7 @@
       </w:r>
       <w:r>
         <w:noBreakHyphen/>
-        <w:t>query row, even if the </w:t>
-      </w:r>
-      <w:proofErr w:type="spellStart"/>
-      <w:r>
-        <w:t>dept_id</w:t>
-      </w:r>
-      <w:proofErr w:type="spellEnd"/>
-      <w:r>
-        <w:t> is the same.</w:t>
+        <w:t>query row, even if the dept_id is the same.</w:t>
       </w:r>
     </w:p>
     <w:p>
@@ -556,15 +532,7 @@
     </w:p>
     <w:p>
       <w:r>
-        <w:t>When </w:t>
-      </w:r>
-      <w:proofErr w:type="spellStart"/>
-      <w:r>
-        <w:t>dept_id</w:t>
-      </w:r>
-      <w:proofErr w:type="spellEnd"/>
-      <w:r>
-        <w:t xml:space="preserve"> = 1 appears three times, the inner query:</w:t>
+        <w:t>When dept_id = 1 appears three times, the inner query:</w:t>
       </w:r>
     </w:p>
     <w:p>
@@ -659,133 +627,85 @@
           <w:b/>
           <w:bCs/>
         </w:rPr>
-        <w:t>Does the database ignore “duplicate” </w:t>
-      </w:r>
-      <w:proofErr w:type="spellStart"/>
+        <w:t>Does the database ignore “duplicate” dept_id values?</w:t>
+      </w:r>
+    </w:p>
+    <w:p>
       <w:r>
         <w:rPr>
           <w:b/>
           <w:bCs/>
         </w:rPr>
-        <w:t>dept_id</w:t>
-      </w:r>
-      <w:proofErr w:type="spellEnd"/>
+        <w:t>No</w:t>
+      </w:r>
+      <w:r>
+        <w:t> — it does not ignore duplicates.</w:t>
+      </w:r>
+      <w:r>
+        <w:br/>
+        <w:t>The database </w:t>
+      </w:r>
       <w:r>
         <w:rPr>
           <w:b/>
           <w:bCs/>
         </w:rPr>
-        <w:t> values?</w:t>
-      </w:r>
-    </w:p>
-    <w:p>
-      <w:r>
+        <w:t>sees that dept_id = 1 occurs three times</w:t>
+      </w:r>
+      <w:r>
+        <w:t>, and each time uses that value to filter the same group and compute the same average.</w:t>
+      </w:r>
+    </w:p>
+    <w:p>
+      <w:r>
+        <w:t>But conceptually you can still say:</w:t>
+      </w:r>
+    </w:p>
+    <w:p>
+      <w:r>
+        <w:t>“Every time dept_id = 1 appears in the outer query, the inner query returns the same average value for that department.”</w:t>
+      </w:r>
+    </w:p>
+    <w:p/>
+    <w:p>
+      <w:pPr>
         <w:rPr>
           <w:b/>
           <w:bCs/>
         </w:rPr>
-        <w:t>No</w:t>
-      </w:r>
-      <w:r>
-        <w:t> — it does not ignore duplicates.</w:t>
-      </w:r>
-      <w:r>
-        <w:br/>
-        <w:t>The database </w:t>
-      </w:r>
+      </w:pPr>
       <w:r>
         <w:rPr>
           <w:b/>
           <w:bCs/>
         </w:rPr>
-        <w:t>sees that </w:t>
-      </w:r>
-      <w:proofErr w:type="spellStart"/>
-      <w:r>
+        <w:lastRenderedPageBreak/>
+        <w:t>Common Table Expressions (CTEs)</w:t>
+      </w:r>
+    </w:p>
+    <w:p>
+      <w:r>
+        <w:t>Common Table Expressions (CTEs) are temporary named result sets defined within a SQL query using the WITH clause. They simplify complex queries by breaking them into readable, reusable parts that exist only for that query's execution.</w:t>
+      </w:r>
+    </w:p>
+    <w:p>
+      <w:pPr>
         <w:rPr>
           <w:b/>
           <w:bCs/>
         </w:rPr>
-        <w:t>dept_id</w:t>
-      </w:r>
-      <w:proofErr w:type="spellEnd"/>
+      </w:pPr>
       <w:r>
         <w:rPr>
           <w:b/>
           <w:bCs/>
         </w:rPr>
-        <w:t xml:space="preserve"> = 1 occurs three times</w:t>
-      </w:r>
-      <w:r>
-        <w:t>, and each time uses that value to filter the same group and compute the same average.</w:t>
-      </w:r>
-    </w:p>
-    <w:p>
-      <w:r>
-        <w:t>But conceptually you can still say:</w:t>
-      </w:r>
-    </w:p>
-    <w:p>
-      <w:r>
-        <w:t>“Every time </w:t>
-      </w:r>
-      <w:proofErr w:type="spellStart"/>
-      <w:r>
-        <w:t>dept_id</w:t>
-      </w:r>
-      <w:proofErr w:type="spellEnd"/>
-      <w:r>
-        <w:t xml:space="preserve"> = 1 appears in the outer query, the inner query returns the same average value for that department.”</w:t>
-      </w:r>
-    </w:p>
-    <w:p/>
-    <w:p>
-      <w:pPr>
-        <w:rPr>
-          <w:b/>
-          <w:bCs/>
-        </w:rPr>
-      </w:pPr>
-      <w:r>
-        <w:rPr>
-          <w:b/>
-          <w:bCs/>
-        </w:rPr>
-        <w:lastRenderedPageBreak/>
-        <w:t>Common Table Expressions (CTEs)</w:t>
-      </w:r>
-    </w:p>
-    <w:p>
-      <w:r>
-        <w:t>Common Table Expressions (CTEs) are temporary named result sets defined within a SQL query using the WITH clause. They simplify complex queries by breaking them into readable, reusable parts that exist only for that query's execution.</w:t>
-      </w:r>
-    </w:p>
-    <w:p>
-      <w:pPr>
-        <w:rPr>
-          <w:b/>
-          <w:bCs/>
-        </w:rPr>
-      </w:pPr>
-      <w:r>
-        <w:rPr>
-          <w:b/>
-          <w:bCs/>
-        </w:rPr>
         <w:t>Basic Syntax</w:t>
       </w:r>
     </w:p>
     <w:p>
       <w:r>
-        <w:t xml:space="preserve">A CTE starts with </w:t>
-      </w:r>
-      <w:proofErr w:type="spellStart"/>
-      <w:r>
-        <w:t>WITH</w:t>
-      </w:r>
-      <w:proofErr w:type="spellEnd"/>
-      <w:r>
-        <w:t>, followed by a name, column aliases (optional), the AS keyword, and a query in parentheses. The main query then references the CTE name like a table.</w:t>
+        <w:t>A CTE starts with WITH, followed by a name, column aliases (optional), the AS keyword, and a query in parentheses. The main query then references the CTE name like a table.</w:t>
       </w:r>
     </w:p>
     <w:p>
@@ -858,15 +778,7 @@
     </w:p>
     <w:p>
       <w:r>
-        <w:t xml:space="preserve">The database evaluates the CTE query first, creating a temporary result set. The main query then uses this set as if it were a real table—supports SELECT, JOIN, </w:t>
-      </w:r>
-      <w:proofErr w:type="gramStart"/>
-      <w:r>
-        <w:t>WHERE</w:t>
-      </w:r>
-      <w:proofErr w:type="gramEnd"/>
-      <w:r>
-        <w:t>, GROUP BY, etc. CTEs are scoped to one statement; they vanish after execution. No indexes exist on CTEs, so performance depends on the underlying query optimization.</w:t>
+        <w:t>The database evaluates the CTE query first, creating a temporary result set. The main query then uses this set as if it were a real table—supports SELECT, JOIN, WHERE, GROUP BY, etc. CTEs are scoped to one statement; they vanish after execution. No indexes exist on CTEs, so performance depends on the underlying query optimization.</w:t>
       </w:r>
     </w:p>
     <w:p>
@@ -1314,6 +1226,9 @@
     </w:p>
     <w:p>
       <w:r>
+        <w:rPr>
+          <w:noProof/>
+        </w:rPr>
         <w:drawing>
           <wp:inline distT="0" distB="0" distL="0" distR="0" wp14:anchorId="0C7ADBE4" wp14:editId="57B3F9D6">
             <wp:extent cx="5943600" cy="781050"/>
@@ -1561,10 +1476,7 @@
     </w:p>
     <w:p>
       <w:r>
-        <w:t>​</w:t>
-      </w:r>
-      <w:r>
-        <w:t> </w:t>
+        <w:t>​ </w:t>
       </w:r>
     </w:p>
     <w:p/>
@@ -1692,6 +1604,9 @@
     </w:p>
     <w:p>
       <w:r>
+        <w:rPr>
+          <w:noProof/>
+        </w:rPr>
         <w:drawing>
           <wp:inline distT="0" distB="0" distL="0" distR="0" wp14:anchorId="7C8CDA35" wp14:editId="23E196F6">
             <wp:extent cx="5943600" cy="1075690"/>
@@ -1738,15 +1653,7 @@
         <w:t>Result column names:</w:t>
       </w:r>
       <w:r>
-        <w:t xml:space="preserve"> id, name, department, </w:t>
-      </w:r>
-      <w:proofErr w:type="spellStart"/>
-      <w:r>
-        <w:t>hourly_rate</w:t>
-      </w:r>
-      <w:proofErr w:type="spellEnd"/>
-      <w:r>
-        <w:t>, city (from contractors only)</w:t>
+        <w:t> id, name, department, hourly_rate, city (from contractors only)</w:t>
       </w:r>
     </w:p>
     <w:p>
@@ -1766,23 +1673,7 @@
         </w:numPr>
       </w:pPr>
       <w:r>
-        <w:t>contractors </w:t>
-      </w:r>
-      <w:proofErr w:type="spellStart"/>
-      <w:r>
-        <w:t>hourly_rate</w:t>
-      </w:r>
-      <w:proofErr w:type="spellEnd"/>
-      <w:r>
-        <w:t> values → stored in </w:t>
-      </w:r>
-      <w:proofErr w:type="spellStart"/>
-      <w:r>
-        <w:t>hourly_rate</w:t>
-      </w:r>
-      <w:proofErr w:type="spellEnd"/>
-      <w:r>
-        <w:t xml:space="preserve"> column </w:t>
+        <w:t xml:space="preserve">contractors hourly_rate values → stored in hourly_rate column </w:t>
       </w:r>
       <w:r>
         <w:rPr>
@@ -1798,13 +1689,8 @@
           <w:numId w:val="73"/>
         </w:numPr>
       </w:pPr>
-      <w:proofErr w:type="gramStart"/>
-      <w:r>
-        <w:t>employees</w:t>
-      </w:r>
-      <w:proofErr w:type="gramEnd"/>
-      <w:r>
-        <w:t> salary values → </w:t>
+      <w:r>
+        <w:t>employees salary values → </w:t>
       </w:r>
       <w:r>
         <w:rPr>
@@ -1814,15 +1700,7 @@
         <w:t>forced into</w:t>
       </w:r>
       <w:r>
-        <w:t> </w:t>
-      </w:r>
-      <w:proofErr w:type="spellStart"/>
-      <w:r>
-        <w:t>hourly_rate</w:t>
-      </w:r>
-      <w:proofErr w:type="spellEnd"/>
-      <w:r>
-        <w:t xml:space="preserve"> column </w:t>
+        <w:t xml:space="preserve"> hourly_rate column </w:t>
       </w:r>
       <w:r>
         <w:rPr>
@@ -1851,6 +1729,9 @@
     </w:p>
     <w:p>
       <w:r>
+        <w:rPr>
+          <w:noProof/>
+        </w:rPr>
         <w:drawing>
           <wp:inline distT="0" distB="0" distL="0" distR="0" wp14:anchorId="21D9E8FB" wp14:editId="723C1B9A">
             <wp:extent cx="5943600" cy="742950"/>
@@ -1912,15 +1793,7 @@
         </w:numPr>
       </w:pPr>
       <w:r>
-        <w:t xml:space="preserve">Column names come ONLY from first SELECT. Second table's data </w:t>
-      </w:r>
-      <w:proofErr w:type="gramStart"/>
-      <w:r>
-        <w:t>gets</w:t>
-      </w:r>
-      <w:proofErr w:type="gramEnd"/>
-      <w:r>
-        <w:t xml:space="preserve"> mapped by position, not name</w:t>
+        <w:t>Column names come ONLY from first SELECT. Second table's data gets mapped by position, not name</w:t>
       </w:r>
     </w:p>
     <w:p>
@@ -1935,6 +1808,9 @@
     </w:p>
     <w:p>
       <w:r>
+        <w:rPr>
+          <w:noProof/>
+        </w:rPr>
         <w:drawing>
           <wp:inline distT="0" distB="0" distL="0" distR="0" wp14:anchorId="2D0DEF9E" wp14:editId="0D34125B">
             <wp:extent cx="5943600" cy="1494155"/>
@@ -2296,11 +2172,22 @@
         <w:rPr>
           <w:b/>
           <w:bCs/>
+          <w:sz w:val="32"/>
+          <w:szCs w:val="32"/>
         </w:rPr>
         <w:t>EXCEPT</w:t>
       </w:r>
       <w:r>
-        <w:t xml:space="preserve"> in PostgreSQL returns rows from the </w:t>
+        <w:rPr>
+          <w:sz w:val="32"/>
+          <w:szCs w:val="32"/>
+        </w:rPr>
+        <w:t xml:space="preserve"> </w:t>
+      </w:r>
+    </w:p>
+    <w:p>
+      <w:r>
+        <w:t>in PostgreSQL returns rows from the </w:t>
       </w:r>
       <w:r>
         <w:rPr>
@@ -2333,6 +2220,671 @@
         <w:t> query. It's the opposite of INTERSECT - finds what's unique to the left side.</w:t>
       </w:r>
     </w:p>
+    <w:p/>
+    <w:p>
+      <w:r>
+        <w:rPr>
+          <w:b/>
+          <w:bCs/>
+          <w:sz w:val="32"/>
+          <w:szCs w:val="32"/>
+        </w:rPr>
+        <w:t>ANY</w:t>
+      </w:r>
+      <w:r>
+        <w:br/>
+      </w:r>
+      <w:r>
+        <w:t>ANY is evaluated row by row in the outer query. For each row, it asks: "Does this row satisfy the condition against any value in the subquery?" — and gives a TRUE or FALSE for that specific row.</w:t>
+      </w:r>
+    </w:p>
+    <w:p>
+      <w:r>
+        <w:t>​</w:t>
+      </w:r>
+      <w:r>
+        <w:t>ANY does </w:t>
+      </w:r>
+      <w:r>
+        <w:rPr>
+          <w:b/>
+          <w:bCs/>
+        </w:rPr>
+        <w:t>not</w:t>
+      </w:r>
+      <w:r>
+        <w:t> return one single TRUE/FALSE for the whole query. It is </w:t>
+      </w:r>
+      <w:r>
+        <w:rPr>
+          <w:b/>
+          <w:bCs/>
+        </w:rPr>
+        <w:t>not</w:t>
+      </w:r>
+      <w:r>
+        <w:t> an aggregate function that summarizes the entire result.</w:t>
+      </w:r>
+    </w:p>
+    <w:p/>
+    <w:p>
+      <w:pPr>
+        <w:rPr>
+          <w:b/>
+          <w:bCs/>
+        </w:rPr>
+      </w:pPr>
+      <w:r>
+        <w:rPr>
+          <w:b/>
+          <w:bCs/>
+        </w:rPr>
+        <w:t>Basic Syntax</w:t>
+      </w:r>
+    </w:p>
+    <w:p>
+      <w:r>
+        <w:rPr>
+          <w:noProof/>
+        </w:rPr>
+        <w:drawing>
+          <wp:inline distT="0" distB="0" distL="0" distR="0" wp14:anchorId="544C7560" wp14:editId="2F90C7AD">
+            <wp:extent cx="5943600" cy="464820"/>
+            <wp:effectExtent l="0" t="0" r="0" b="0"/>
+            <wp:docPr id="1912208896" name="Picture 1"/>
+            <wp:cNvGraphicFramePr>
+              <a:graphicFrameLocks xmlns:a="http://schemas.openxmlformats.org/drawingml/2006/main" noChangeAspect="1"/>
+            </wp:cNvGraphicFramePr>
+            <a:graphic xmlns:a="http://schemas.openxmlformats.org/drawingml/2006/main">
+              <a:graphicData uri="http://schemas.openxmlformats.org/drawingml/2006/picture">
+                <pic:pic xmlns:pic="http://schemas.openxmlformats.org/drawingml/2006/picture">
+                  <pic:nvPicPr>
+                    <pic:cNvPr id="1912208896" name=""/>
+                    <pic:cNvPicPr/>
+                  </pic:nvPicPr>
+                  <pic:blipFill>
+                    <a:blip r:embed="rId19"/>
+                    <a:stretch>
+                      <a:fillRect/>
+                    </a:stretch>
+                  </pic:blipFill>
+                  <pic:spPr>
+                    <a:xfrm>
+                      <a:off x="0" y="0"/>
+                      <a:ext cx="5943600" cy="464820"/>
+                    </a:xfrm>
+                    <a:prstGeom prst="rect">
+                      <a:avLst/>
+                    </a:prstGeom>
+                  </pic:spPr>
+                </pic:pic>
+              </a:graphicData>
+            </a:graphic>
+          </wp:inline>
+        </w:drawing>
+      </w:r>
+    </w:p>
+    <w:p>
+      <w:r>
+        <w:rPr>
+          <w:b/>
+          <w:bCs/>
+        </w:rPr>
+        <w:t>Common operators:</w:t>
+      </w:r>
+      <w:r>
+        <w:t> = ANY, &gt; ANY, &lt; ANY, IN (which equals = ANY)</w:t>
+      </w:r>
+    </w:p>
+    <w:p>
+      <w:pPr>
+        <w:rPr>
+          <w:b/>
+          <w:bCs/>
+        </w:rPr>
+      </w:pPr>
+      <w:r>
+        <w:rPr>
+          <w:b/>
+          <w:bCs/>
+        </w:rPr>
+        <w:t>Think of it this way using a simple example:</w:t>
+      </w:r>
+    </w:p>
+    <w:p>
+      <w:r>
+        <w:drawing>
+          <wp:inline distT="0" distB="0" distL="0" distR="0" wp14:anchorId="4DAD9D0A" wp14:editId="20CB5EFD">
+            <wp:extent cx="5943600" cy="511175"/>
+            <wp:effectExtent l="0" t="0" r="0" b="3175"/>
+            <wp:docPr id="85002621" name="Picture 1"/>
+            <wp:cNvGraphicFramePr>
+              <a:graphicFrameLocks xmlns:a="http://schemas.openxmlformats.org/drawingml/2006/main" noChangeAspect="1"/>
+            </wp:cNvGraphicFramePr>
+            <a:graphic xmlns:a="http://schemas.openxmlformats.org/drawingml/2006/main">
+              <a:graphicData uri="http://schemas.openxmlformats.org/drawingml/2006/picture">
+                <pic:pic xmlns:pic="http://schemas.openxmlformats.org/drawingml/2006/picture">
+                  <pic:nvPicPr>
+                    <pic:cNvPr id="85002621" name=""/>
+                    <pic:cNvPicPr/>
+                  </pic:nvPicPr>
+                  <pic:blipFill>
+                    <a:blip r:embed="rId20"/>
+                    <a:stretch>
+                      <a:fillRect/>
+                    </a:stretch>
+                  </pic:blipFill>
+                  <pic:spPr>
+                    <a:xfrm>
+                      <a:off x="0" y="0"/>
+                      <a:ext cx="5943600" cy="511175"/>
+                    </a:xfrm>
+                    <a:prstGeom prst="rect">
+                      <a:avLst/>
+                    </a:prstGeom>
+                  </pic:spPr>
+                </pic:pic>
+              </a:graphicData>
+            </a:graphic>
+          </wp:inline>
+        </w:drawing>
+      </w:r>
+    </w:p>
+    <w:p>
+      <w:r>
+        <w:t>The subquery runs </w:t>
+      </w:r>
+      <w:r>
+        <w:rPr>
+          <w:b/>
+          <w:bCs/>
+        </w:rPr>
+        <w:t>once</w:t>
+      </w:r>
+      <w:r>
+        <w:t> and returns a fixed list, say {55000, 58000, 60000}. Then for </w:t>
+      </w:r>
+      <w:r>
+        <w:rPr>
+          <w:b/>
+          <w:bCs/>
+        </w:rPr>
+        <w:t>each employee row</w:t>
+      </w:r>
+      <w:r>
+        <w:t>, PostgreSQL checks:</w:t>
+      </w:r>
+    </w:p>
+    <w:p>
+      <w:r>
+        <w:drawing>
+          <wp:inline distT="0" distB="0" distL="0" distR="0" wp14:anchorId="2F0E8ACE" wp14:editId="25A327A7">
+            <wp:extent cx="5943600" cy="699770"/>
+            <wp:effectExtent l="0" t="0" r="0" b="5080"/>
+            <wp:docPr id="284931292" name="Picture 1"/>
+            <wp:cNvGraphicFramePr>
+              <a:graphicFrameLocks xmlns:a="http://schemas.openxmlformats.org/drawingml/2006/main" noChangeAspect="1"/>
+            </wp:cNvGraphicFramePr>
+            <a:graphic xmlns:a="http://schemas.openxmlformats.org/drawingml/2006/main">
+              <a:graphicData uri="http://schemas.openxmlformats.org/drawingml/2006/picture">
+                <pic:pic xmlns:pic="http://schemas.openxmlformats.org/drawingml/2006/picture">
+                  <pic:nvPicPr>
+                    <pic:cNvPr id="284931292" name=""/>
+                    <pic:cNvPicPr/>
+                  </pic:nvPicPr>
+                  <pic:blipFill>
+                    <a:blip r:embed="rId21"/>
+                    <a:stretch>
+                      <a:fillRect/>
+                    </a:stretch>
+                  </pic:blipFill>
+                  <pic:spPr>
+                    <a:xfrm>
+                      <a:off x="0" y="0"/>
+                      <a:ext cx="5943600" cy="699770"/>
+                    </a:xfrm>
+                    <a:prstGeom prst="rect">
+                      <a:avLst/>
+                    </a:prstGeom>
+                  </pic:spPr>
+                </pic:pic>
+              </a:graphicData>
+            </a:graphic>
+          </wp:inline>
+        </w:drawing>
+      </w:r>
+    </w:p>
+    <w:p>
+      <w:r>
+        <w:t>The final result you see is the </w:t>
+      </w:r>
+      <w:r>
+        <w:rPr>
+          <w:b/>
+          <w:bCs/>
+        </w:rPr>
+        <w:t>collection of rows</w:t>
+      </w:r>
+      <w:r>
+        <w:t> where ANY returned TRUE</w:t>
+      </w:r>
+    </w:p>
+    <w:p>
+      <w:r>
+        <w:t>ANY returns one boolean per row, not one boolean for the entire query. The final output is a result set of all rows where that boolean was TRUE.</w:t>
+      </w:r>
+    </w:p>
+    <w:p>
+      <w:pPr>
+        <w:rPr>
+          <w:b/>
+          <w:bCs/>
+        </w:rPr>
+      </w:pPr>
+      <w:r>
+        <w:rPr>
+          <w:b/>
+          <w:bCs/>
+        </w:rPr>
+        <w:lastRenderedPageBreak/>
+        <w:t>ANY vs ALL vs IN</w:t>
+      </w:r>
+    </w:p>
+    <w:p>
+      <w:r>
+        <w:rPr>
+          <w:noProof/>
+        </w:rPr>
+        <w:drawing>
+          <wp:inline distT="0" distB="0" distL="0" distR="0" wp14:anchorId="6102A82E" wp14:editId="136B50AB">
+            <wp:extent cx="5943600" cy="810895"/>
+            <wp:effectExtent l="0" t="0" r="0" b="8255"/>
+            <wp:docPr id="1558365776" name="Picture 1"/>
+            <wp:cNvGraphicFramePr>
+              <a:graphicFrameLocks xmlns:a="http://schemas.openxmlformats.org/drawingml/2006/main" noChangeAspect="1"/>
+            </wp:cNvGraphicFramePr>
+            <a:graphic xmlns:a="http://schemas.openxmlformats.org/drawingml/2006/main">
+              <a:graphicData uri="http://schemas.openxmlformats.org/drawingml/2006/picture">
+                <pic:pic xmlns:pic="http://schemas.openxmlformats.org/drawingml/2006/picture">
+                  <pic:nvPicPr>
+                    <pic:cNvPr id="1558365776" name=""/>
+                    <pic:cNvPicPr/>
+                  </pic:nvPicPr>
+                  <pic:blipFill>
+                    <a:blip r:embed="rId22"/>
+                    <a:stretch>
+                      <a:fillRect/>
+                    </a:stretch>
+                  </pic:blipFill>
+                  <pic:spPr>
+                    <a:xfrm>
+                      <a:off x="0" y="0"/>
+                      <a:ext cx="5943600" cy="810895"/>
+                    </a:xfrm>
+                    <a:prstGeom prst="rect">
+                      <a:avLst/>
+                    </a:prstGeom>
+                  </pic:spPr>
+                </pic:pic>
+              </a:graphicData>
+            </a:graphic>
+          </wp:inline>
+        </w:drawing>
+      </w:r>
+    </w:p>
+    <w:p>
+      <w:r>
+        <w:t>The ANY operator allows you to perform a comparison between a single column value and a range of other values.</w:t>
+      </w:r>
+    </w:p>
+    <w:p>
+      <w:r>
+        <w:t>The ANY operator:</w:t>
+      </w:r>
+    </w:p>
+    <w:p>
+      <w:pPr>
+        <w:numPr>
+          <w:ilvl w:val="0"/>
+          <w:numId w:val="78"/>
+        </w:numPr>
+      </w:pPr>
+      <w:r>
+        <w:t>returns a Boolean value as a result</w:t>
+      </w:r>
+    </w:p>
+    <w:p>
+      <w:pPr>
+        <w:numPr>
+          <w:ilvl w:val="0"/>
+          <w:numId w:val="78"/>
+        </w:numPr>
+      </w:pPr>
+      <w:r>
+        <w:t>returns TRUE if ANY of the sub query values meet the condition</w:t>
+      </w:r>
+    </w:p>
+    <w:p>
+      <w:r>
+        <w:t>ANY means that the condition will be true if the operation is true for any of the values in the range.</w:t>
+      </w:r>
+    </w:p>
+    <w:p/>
+    <w:p/>
+    <w:p>
+      <w:pPr>
+        <w:rPr>
+          <w:b/>
+          <w:bCs/>
+          <w:sz w:val="32"/>
+          <w:szCs w:val="32"/>
+        </w:rPr>
+      </w:pPr>
+      <w:r>
+        <w:rPr>
+          <w:b/>
+          <w:bCs/>
+          <w:sz w:val="32"/>
+          <w:szCs w:val="32"/>
+        </w:rPr>
+        <w:t>ALL</w:t>
+      </w:r>
+    </w:p>
+    <w:p>
+      <w:r>
+        <w:t>The ALL operator:</w:t>
+      </w:r>
+    </w:p>
+    <w:p>
+      <w:pPr>
+        <w:numPr>
+          <w:ilvl w:val="0"/>
+          <w:numId w:val="79"/>
+        </w:numPr>
+      </w:pPr>
+      <w:r>
+        <w:t>returns a Boolean value as a result</w:t>
+      </w:r>
+    </w:p>
+    <w:p>
+      <w:pPr>
+        <w:numPr>
+          <w:ilvl w:val="0"/>
+          <w:numId w:val="79"/>
+        </w:numPr>
+      </w:pPr>
+      <w:r>
+        <w:t>returns TRUE if ALL of the sub query values meet the condition</w:t>
+      </w:r>
+    </w:p>
+    <w:p>
+      <w:pPr>
+        <w:numPr>
+          <w:ilvl w:val="0"/>
+          <w:numId w:val="79"/>
+        </w:numPr>
+      </w:pPr>
+      <w:r>
+        <w:t>is used with SELECT, WHERE and HAVING statements</w:t>
+      </w:r>
+    </w:p>
+    <w:p>
+      <w:r>
+        <w:t>ALL means that the condition will be true only if the operation is true for all values in the range.</w:t>
+      </w:r>
+    </w:p>
+    <w:p>
+      <w:r>
+        <w:rPr>
+          <w:noProof/>
+        </w:rPr>
+        <w:drawing>
+          <wp:inline distT="0" distB="0" distL="0" distR="0" wp14:anchorId="3AB09416" wp14:editId="232DF1DA">
+            <wp:extent cx="4077269" cy="2076740"/>
+            <wp:effectExtent l="0" t="0" r="0" b="0"/>
+            <wp:docPr id="30592012" name="Picture 1"/>
+            <wp:cNvGraphicFramePr>
+              <a:graphicFrameLocks xmlns:a="http://schemas.openxmlformats.org/drawingml/2006/main" noChangeAspect="1"/>
+            </wp:cNvGraphicFramePr>
+            <a:graphic xmlns:a="http://schemas.openxmlformats.org/drawingml/2006/main">
+              <a:graphicData uri="http://schemas.openxmlformats.org/drawingml/2006/picture">
+                <pic:pic xmlns:pic="http://schemas.openxmlformats.org/drawingml/2006/picture">
+                  <pic:nvPicPr>
+                    <pic:cNvPr id="30592012" name=""/>
+                    <pic:cNvPicPr/>
+                  </pic:nvPicPr>
+                  <pic:blipFill>
+                    <a:blip r:embed="rId23"/>
+                    <a:stretch>
+                      <a:fillRect/>
+                    </a:stretch>
+                  </pic:blipFill>
+                  <pic:spPr>
+                    <a:xfrm>
+                      <a:off x="0" y="0"/>
+                      <a:ext cx="4077269" cy="2076740"/>
+                    </a:xfrm>
+                    <a:prstGeom prst="rect">
+                      <a:avLst/>
+                    </a:prstGeom>
+                  </pic:spPr>
+                </pic:pic>
+              </a:graphicData>
+            </a:graphic>
+          </wp:inline>
+        </w:drawing>
+      </w:r>
+    </w:p>
+    <w:p/>
+    <w:p>
+      <w:pPr>
+        <w:rPr>
+          <w:b/>
+          <w:bCs/>
+          <w:sz w:val="32"/>
+          <w:szCs w:val="32"/>
+        </w:rPr>
+      </w:pPr>
+      <w:r>
+        <w:rPr>
+          <w:b/>
+          <w:bCs/>
+          <w:sz w:val="32"/>
+          <w:szCs w:val="32"/>
+        </w:rPr>
+        <w:t>EXISTS</w:t>
+      </w:r>
+    </w:p>
+    <w:p>
+      <w:r>
+        <w:t>The EXISTS operator is used to test for the existence of any record in a sub query.</w:t>
+      </w:r>
+    </w:p>
+    <w:p>
+      <w:r>
+        <w:t>The EXISTS operator returns TRUE if the sub query returns one or more records.</w:t>
+      </w:r>
+    </w:p>
+    <w:p>
+      <w:r>
+        <w:rPr>
+          <w:noProof/>
+        </w:rPr>
+        <w:drawing>
+          <wp:inline distT="0" distB="0" distL="0" distR="0" wp14:anchorId="47EF35DF" wp14:editId="3EF28B52">
+            <wp:extent cx="5925377" cy="2029108"/>
+            <wp:effectExtent l="0" t="0" r="0" b="9525"/>
+            <wp:docPr id="1893308440" name="Picture 1"/>
+            <wp:cNvGraphicFramePr>
+              <a:graphicFrameLocks xmlns:a="http://schemas.openxmlformats.org/drawingml/2006/main" noChangeAspect="1"/>
+            </wp:cNvGraphicFramePr>
+            <a:graphic xmlns:a="http://schemas.openxmlformats.org/drawingml/2006/main">
+              <a:graphicData uri="http://schemas.openxmlformats.org/drawingml/2006/picture">
+                <pic:pic xmlns:pic="http://schemas.openxmlformats.org/drawingml/2006/picture">
+                  <pic:nvPicPr>
+                    <pic:cNvPr id="1893308440" name=""/>
+                    <pic:cNvPicPr/>
+                  </pic:nvPicPr>
+                  <pic:blipFill>
+                    <a:blip r:embed="rId24"/>
+                    <a:stretch>
+                      <a:fillRect/>
+                    </a:stretch>
+                  </pic:blipFill>
+                  <pic:spPr>
+                    <a:xfrm>
+                      <a:off x="0" y="0"/>
+                      <a:ext cx="5925377" cy="2029108"/>
+                    </a:xfrm>
+                    <a:prstGeom prst="rect">
+                      <a:avLst/>
+                    </a:prstGeom>
+                  </pic:spPr>
+                </pic:pic>
+              </a:graphicData>
+            </a:graphic>
+          </wp:inline>
+        </w:drawing>
+      </w:r>
+    </w:p>
+    <w:p>
+      <w:r>
+        <w:t>You can write </w:t>
+      </w:r>
+      <w:r>
+        <w:rPr>
+          <w:b/>
+          <w:bCs/>
+        </w:rPr>
+        <w:t>ANY value</w:t>
+      </w:r>
+      <w:r>
+        <w:t> there — 1, 2, 3, 'ravi', NULL — </w:t>
+      </w:r>
+      <w:r>
+        <w:rPr>
+          <w:b/>
+          <w:bCs/>
+        </w:rPr>
+        <w:t>it makes ZERO difference</w:t>
+      </w:r>
+      <w:r>
+        <w:t>!</w:t>
+      </w:r>
+    </w:p>
+    <w:p>
+      <w:r>
+        <w:drawing>
+          <wp:inline distT="0" distB="0" distL="0" distR="0" wp14:anchorId="3AD3C4D4" wp14:editId="55DA4338">
+            <wp:extent cx="5943600" cy="1361440"/>
+            <wp:effectExtent l="0" t="0" r="0" b="0"/>
+            <wp:docPr id="1239317963" name="Picture 1"/>
+            <wp:cNvGraphicFramePr>
+              <a:graphicFrameLocks xmlns:a="http://schemas.openxmlformats.org/drawingml/2006/main" noChangeAspect="1"/>
+            </wp:cNvGraphicFramePr>
+            <a:graphic xmlns:a="http://schemas.openxmlformats.org/drawingml/2006/main">
+              <a:graphicData uri="http://schemas.openxmlformats.org/drawingml/2006/picture">
+                <pic:pic xmlns:pic="http://schemas.openxmlformats.org/drawingml/2006/picture">
+                  <pic:nvPicPr>
+                    <pic:cNvPr id="1239317963" name=""/>
+                    <pic:cNvPicPr/>
+                  </pic:nvPicPr>
+                  <pic:blipFill>
+                    <a:blip r:embed="rId25"/>
+                    <a:stretch>
+                      <a:fillRect/>
+                    </a:stretch>
+                  </pic:blipFill>
+                  <pic:spPr>
+                    <a:xfrm>
+                      <a:off x="0" y="0"/>
+                      <a:ext cx="5943600" cy="1361440"/>
+                    </a:xfrm>
+                    <a:prstGeom prst="rect">
+                      <a:avLst/>
+                    </a:prstGeom>
+                  </pic:spPr>
+                </pic:pic>
+              </a:graphicData>
+            </a:graphic>
+          </wp:inline>
+        </w:drawing>
+      </w:r>
+    </w:p>
+    <w:p/>
+    <w:p>
+      <w:r>
+        <w:rPr>
+          <w:b/>
+          <w:bCs/>
+        </w:rPr>
+        <w:t>ANY and EXISTS are different.</w:t>
+      </w:r>
+      <w:r>
+        <w:t> Here's the key distinction:</w:t>
+      </w:r>
+    </w:p>
+    <w:p>
+      <w:pPr>
+        <w:rPr>
+          <w:b/>
+          <w:bCs/>
+        </w:rPr>
+      </w:pPr>
+      <w:r>
+        <w:rPr>
+          <w:b/>
+          <w:bCs/>
+        </w:rPr>
+        <w:t>ANY = Comparison (returns matching rows)</w:t>
+      </w:r>
+    </w:p>
+    <w:p>
+      <w:r>
+        <w:t>Compares </w:t>
+      </w:r>
+      <w:r>
+        <w:rPr>
+          <w:b/>
+          <w:bCs/>
+        </w:rPr>
+        <w:t>column values</w:t>
+      </w:r>
+      <w:r>
+        <w:t> against subquery results, returns rows where condition matches.</w:t>
+      </w:r>
+    </w:p>
+    <w:p>
+      <w:pPr>
+        <w:rPr>
+          <w:b/>
+          <w:bCs/>
+        </w:rPr>
+      </w:pPr>
+      <w:r>
+        <w:rPr>
+          <w:b/>
+          <w:bCs/>
+        </w:rPr>
+        <w:t>EXISTS = Presence check (just true/false)</w:t>
+      </w:r>
+    </w:p>
+    <w:p>
+      <w:r>
+        <w:t>Checks if </w:t>
+      </w:r>
+      <w:r>
+        <w:rPr>
+          <w:b/>
+          <w:bCs/>
+        </w:rPr>
+        <w:t>subquery returns any rows</w:t>
+      </w:r>
+      <w:r>
+        <w:t>, returns rows where subquery exists.</w:t>
+      </w:r>
+    </w:p>
+    <w:p/>
     <w:p/>
     <w:sectPr>
       <w:pgSz w:w="12240" w:h="15840"/>
@@ -3806,6 +4358,155 @@
     </w:lvl>
   </w:abstractNum>
   <w:abstractNum w:abstractNumId="11" w15:restartNumberingAfterBreak="0">
+    <w:nsid w:val="1C244091"/>
+    <w:multiLevelType w:val="multilevel"/>
+    <w:tmpl w:val="66DC7EAE"/>
+    <w:lvl w:ilvl="0">
+      <w:start w:val="1"/>
+      <w:numFmt w:val="bullet"/>
+      <w:lvlText w:val=""/>
+      <w:lvlJc w:val="left"/>
+      <w:pPr>
+        <w:tabs>
+          <w:tab w:val="num" w:pos="720"/>
+        </w:tabs>
+        <w:ind w:left="720" w:hanging="360"/>
+      </w:pPr>
+      <w:rPr>
+        <w:rFonts w:ascii="Symbol" w:hAnsi="Symbol" w:hint="default"/>
+        <w:sz w:val="20"/>
+      </w:rPr>
+    </w:lvl>
+    <w:lvl w:ilvl="1" w:tentative="1">
+      <w:start w:val="1"/>
+      <w:numFmt w:val="bullet"/>
+      <w:lvlText w:val="o"/>
+      <w:lvlJc w:val="left"/>
+      <w:pPr>
+        <w:tabs>
+          <w:tab w:val="num" w:pos="1440"/>
+        </w:tabs>
+        <w:ind w:left="1440" w:hanging="360"/>
+      </w:pPr>
+      <w:rPr>
+        <w:rFonts w:ascii="Courier New" w:hAnsi="Courier New" w:hint="default"/>
+        <w:sz w:val="20"/>
+      </w:rPr>
+    </w:lvl>
+    <w:lvl w:ilvl="2" w:tentative="1">
+      <w:start w:val="1"/>
+      <w:numFmt w:val="bullet"/>
+      <w:lvlText w:val=""/>
+      <w:lvlJc w:val="left"/>
+      <w:pPr>
+        <w:tabs>
+          <w:tab w:val="num" w:pos="2160"/>
+        </w:tabs>
+        <w:ind w:left="2160" w:hanging="360"/>
+      </w:pPr>
+      <w:rPr>
+        <w:rFonts w:ascii="Wingdings" w:hAnsi="Wingdings" w:hint="default"/>
+        <w:sz w:val="20"/>
+      </w:rPr>
+    </w:lvl>
+    <w:lvl w:ilvl="3" w:tentative="1">
+      <w:start w:val="1"/>
+      <w:numFmt w:val="bullet"/>
+      <w:lvlText w:val=""/>
+      <w:lvlJc w:val="left"/>
+      <w:pPr>
+        <w:tabs>
+          <w:tab w:val="num" w:pos="2880"/>
+        </w:tabs>
+        <w:ind w:left="2880" w:hanging="360"/>
+      </w:pPr>
+      <w:rPr>
+        <w:rFonts w:ascii="Wingdings" w:hAnsi="Wingdings" w:hint="default"/>
+        <w:sz w:val="20"/>
+      </w:rPr>
+    </w:lvl>
+    <w:lvl w:ilvl="4" w:tentative="1">
+      <w:start w:val="1"/>
+      <w:numFmt w:val="bullet"/>
+      <w:lvlText w:val=""/>
+      <w:lvlJc w:val="left"/>
+      <w:pPr>
+        <w:tabs>
+          <w:tab w:val="num" w:pos="3600"/>
+        </w:tabs>
+        <w:ind w:left="3600" w:hanging="360"/>
+      </w:pPr>
+      <w:rPr>
+        <w:rFonts w:ascii="Wingdings" w:hAnsi="Wingdings" w:hint="default"/>
+        <w:sz w:val="20"/>
+      </w:rPr>
+    </w:lvl>
+    <w:lvl w:ilvl="5" w:tentative="1">
+      <w:start w:val="1"/>
+      <w:numFmt w:val="bullet"/>
+      <w:lvlText w:val=""/>
+      <w:lvlJc w:val="left"/>
+      <w:pPr>
+        <w:tabs>
+          <w:tab w:val="num" w:pos="4320"/>
+        </w:tabs>
+        <w:ind w:left="4320" w:hanging="360"/>
+      </w:pPr>
+      <w:rPr>
+        <w:rFonts w:ascii="Wingdings" w:hAnsi="Wingdings" w:hint="default"/>
+        <w:sz w:val="20"/>
+      </w:rPr>
+    </w:lvl>
+    <w:lvl w:ilvl="6" w:tentative="1">
+      <w:start w:val="1"/>
+      <w:numFmt w:val="bullet"/>
+      <w:lvlText w:val=""/>
+      <w:lvlJc w:val="left"/>
+      <w:pPr>
+        <w:tabs>
+          <w:tab w:val="num" w:pos="5040"/>
+        </w:tabs>
+        <w:ind w:left="5040" w:hanging="360"/>
+      </w:pPr>
+      <w:rPr>
+        <w:rFonts w:ascii="Wingdings" w:hAnsi="Wingdings" w:hint="default"/>
+        <w:sz w:val="20"/>
+      </w:rPr>
+    </w:lvl>
+    <w:lvl w:ilvl="7" w:tentative="1">
+      <w:start w:val="1"/>
+      <w:numFmt w:val="bullet"/>
+      <w:lvlText w:val=""/>
+      <w:lvlJc w:val="left"/>
+      <w:pPr>
+        <w:tabs>
+          <w:tab w:val="num" w:pos="5760"/>
+        </w:tabs>
+        <w:ind w:left="5760" w:hanging="360"/>
+      </w:pPr>
+      <w:rPr>
+        <w:rFonts w:ascii="Wingdings" w:hAnsi="Wingdings" w:hint="default"/>
+        <w:sz w:val="20"/>
+      </w:rPr>
+    </w:lvl>
+    <w:lvl w:ilvl="8" w:tentative="1">
+      <w:start w:val="1"/>
+      <w:numFmt w:val="bullet"/>
+      <w:lvlText w:val=""/>
+      <w:lvlJc w:val="left"/>
+      <w:pPr>
+        <w:tabs>
+          <w:tab w:val="num" w:pos="6480"/>
+        </w:tabs>
+        <w:ind w:left="6480" w:hanging="360"/>
+      </w:pPr>
+      <w:rPr>
+        <w:rFonts w:ascii="Wingdings" w:hAnsi="Wingdings" w:hint="default"/>
+        <w:sz w:val="20"/>
+      </w:rPr>
+    </w:lvl>
+  </w:abstractNum>
+  <w:abstractNum w:abstractNumId="12" w15:restartNumberingAfterBreak="0">
     <w:nsid w:val="1E6F519E"/>
     <w:multiLevelType w:val="multilevel"/>
     <w:tmpl w:val="D78805DC"/>
@@ -3954,7 +4655,7 @@
       </w:rPr>
     </w:lvl>
   </w:abstractNum>
-  <w:abstractNum w:abstractNumId="12" w15:restartNumberingAfterBreak="0">
+  <w:abstractNum w:abstractNumId="13" w15:restartNumberingAfterBreak="0">
     <w:nsid w:val="229578B0"/>
     <w:multiLevelType w:val="hybridMultilevel"/>
     <w:tmpl w:val="9A1A42E6"/>
@@ -4067,7 +4768,7 @@
       </w:rPr>
     </w:lvl>
   </w:abstractNum>
-  <w:abstractNum w:abstractNumId="13" w15:restartNumberingAfterBreak="0">
+  <w:abstractNum w:abstractNumId="14" w15:restartNumberingAfterBreak="0">
     <w:nsid w:val="27F50F5B"/>
     <w:multiLevelType w:val="multilevel"/>
     <w:tmpl w:val="849262BC"/>
@@ -4216,7 +4917,7 @@
       </w:rPr>
     </w:lvl>
   </w:abstractNum>
-  <w:abstractNum w:abstractNumId="14" w15:restartNumberingAfterBreak="0">
+  <w:abstractNum w:abstractNumId="15" w15:restartNumberingAfterBreak="0">
     <w:nsid w:val="29EC7F31"/>
     <w:multiLevelType w:val="multilevel"/>
     <w:tmpl w:val="AD6486D2"/>
@@ -4365,7 +5066,7 @@
       </w:rPr>
     </w:lvl>
   </w:abstractNum>
-  <w:abstractNum w:abstractNumId="15" w15:restartNumberingAfterBreak="0">
+  <w:abstractNum w:abstractNumId="16" w15:restartNumberingAfterBreak="0">
     <w:nsid w:val="2CD76F79"/>
     <w:multiLevelType w:val="multilevel"/>
     <w:tmpl w:val="7C5A0208"/>
@@ -4514,7 +5215,7 @@
       </w:rPr>
     </w:lvl>
   </w:abstractNum>
-  <w:abstractNum w:abstractNumId="16" w15:restartNumberingAfterBreak="0">
+  <w:abstractNum w:abstractNumId="17" w15:restartNumberingAfterBreak="0">
     <w:nsid w:val="2D525BCD"/>
     <w:multiLevelType w:val="hybridMultilevel"/>
     <w:tmpl w:val="01E64C9E"/>
@@ -4627,7 +5328,7 @@
       </w:rPr>
     </w:lvl>
   </w:abstractNum>
-  <w:abstractNum w:abstractNumId="17" w15:restartNumberingAfterBreak="0">
+  <w:abstractNum w:abstractNumId="18" w15:restartNumberingAfterBreak="0">
     <w:nsid w:val="2DE57147"/>
     <w:multiLevelType w:val="hybridMultilevel"/>
     <w:tmpl w:val="A9D4DC8A"/>
@@ -4740,7 +5441,7 @@
       </w:rPr>
     </w:lvl>
   </w:abstractNum>
-  <w:abstractNum w:abstractNumId="18" w15:restartNumberingAfterBreak="0">
+  <w:abstractNum w:abstractNumId="19" w15:restartNumberingAfterBreak="0">
     <w:nsid w:val="2E3D2127"/>
     <w:multiLevelType w:val="multilevel"/>
     <w:tmpl w:val="21C4D906"/>
@@ -4889,7 +5590,7 @@
       </w:rPr>
     </w:lvl>
   </w:abstractNum>
-  <w:abstractNum w:abstractNumId="19" w15:restartNumberingAfterBreak="0">
+  <w:abstractNum w:abstractNumId="20" w15:restartNumberingAfterBreak="0">
     <w:nsid w:val="2F063D47"/>
     <w:multiLevelType w:val="multilevel"/>
     <w:tmpl w:val="3D369E3E"/>
@@ -5038,7 +5739,7 @@
       </w:rPr>
     </w:lvl>
   </w:abstractNum>
-  <w:abstractNum w:abstractNumId="20" w15:restartNumberingAfterBreak="0">
+  <w:abstractNum w:abstractNumId="21" w15:restartNumberingAfterBreak="0">
     <w:nsid w:val="33A8037F"/>
     <w:multiLevelType w:val="multilevel"/>
     <w:tmpl w:val="AE548180"/>
@@ -5187,7 +5888,7 @@
       </w:rPr>
     </w:lvl>
   </w:abstractNum>
-  <w:abstractNum w:abstractNumId="21" w15:restartNumberingAfterBreak="0">
+  <w:abstractNum w:abstractNumId="22" w15:restartNumberingAfterBreak="0">
     <w:nsid w:val="34CD6A6D"/>
     <w:multiLevelType w:val="multilevel"/>
     <w:tmpl w:val="3BD4BB84"/>
@@ -5336,7 +6037,7 @@
       </w:rPr>
     </w:lvl>
   </w:abstractNum>
-  <w:abstractNum w:abstractNumId="22" w15:restartNumberingAfterBreak="0">
+  <w:abstractNum w:abstractNumId="23" w15:restartNumberingAfterBreak="0">
     <w:nsid w:val="35C50552"/>
     <w:multiLevelType w:val="multilevel"/>
     <w:tmpl w:val="71D0C52A"/>
@@ -5485,7 +6186,7 @@
       </w:rPr>
     </w:lvl>
   </w:abstractNum>
-  <w:abstractNum w:abstractNumId="23" w15:restartNumberingAfterBreak="0">
+  <w:abstractNum w:abstractNumId="24" w15:restartNumberingAfterBreak="0">
     <w:nsid w:val="362B3D85"/>
     <w:multiLevelType w:val="multilevel"/>
     <w:tmpl w:val="A614BA40"/>
@@ -5598,7 +6299,7 @@
       </w:pPr>
     </w:lvl>
   </w:abstractNum>
-  <w:abstractNum w:abstractNumId="24" w15:restartNumberingAfterBreak="0">
+  <w:abstractNum w:abstractNumId="25" w15:restartNumberingAfterBreak="0">
     <w:nsid w:val="37D65C62"/>
     <w:multiLevelType w:val="hybridMultilevel"/>
     <w:tmpl w:val="AD5E9626"/>
@@ -5711,7 +6412,7 @@
       </w:rPr>
     </w:lvl>
   </w:abstractNum>
-  <w:abstractNum w:abstractNumId="25" w15:restartNumberingAfterBreak="0">
+  <w:abstractNum w:abstractNumId="26" w15:restartNumberingAfterBreak="0">
     <w:nsid w:val="384B6146"/>
     <w:multiLevelType w:val="multilevel"/>
     <w:tmpl w:val="03788954"/>
@@ -5860,7 +6561,7 @@
       </w:rPr>
     </w:lvl>
   </w:abstractNum>
-  <w:abstractNum w:abstractNumId="26" w15:restartNumberingAfterBreak="0">
+  <w:abstractNum w:abstractNumId="27" w15:restartNumberingAfterBreak="0">
     <w:nsid w:val="3A977AA6"/>
     <w:multiLevelType w:val="multilevel"/>
     <w:tmpl w:val="F3245ADE"/>
@@ -6009,7 +6710,7 @@
       </w:rPr>
     </w:lvl>
   </w:abstractNum>
-  <w:abstractNum w:abstractNumId="27" w15:restartNumberingAfterBreak="0">
+  <w:abstractNum w:abstractNumId="28" w15:restartNumberingAfterBreak="0">
     <w:nsid w:val="3AFB6271"/>
     <w:multiLevelType w:val="multilevel"/>
     <w:tmpl w:val="9BF20B12"/>
@@ -6158,7 +6859,7 @@
       </w:rPr>
     </w:lvl>
   </w:abstractNum>
-  <w:abstractNum w:abstractNumId="28" w15:restartNumberingAfterBreak="0">
+  <w:abstractNum w:abstractNumId="29" w15:restartNumberingAfterBreak="0">
     <w:nsid w:val="3DA40973"/>
     <w:multiLevelType w:val="multilevel"/>
     <w:tmpl w:val="6D2E18A8"/>
@@ -6307,7 +7008,7 @@
       </w:rPr>
     </w:lvl>
   </w:abstractNum>
-  <w:abstractNum w:abstractNumId="29" w15:restartNumberingAfterBreak="0">
+  <w:abstractNum w:abstractNumId="30" w15:restartNumberingAfterBreak="0">
     <w:nsid w:val="40A670BD"/>
     <w:multiLevelType w:val="multilevel"/>
     <w:tmpl w:val="BF50D4FA"/>
@@ -6420,7 +7121,7 @@
       </w:pPr>
     </w:lvl>
   </w:abstractNum>
-  <w:abstractNum w:abstractNumId="30" w15:restartNumberingAfterBreak="0">
+  <w:abstractNum w:abstractNumId="31" w15:restartNumberingAfterBreak="0">
     <w:nsid w:val="43A30246"/>
     <w:multiLevelType w:val="multilevel"/>
     <w:tmpl w:val="B680CD42"/>
@@ -6569,7 +7270,7 @@
       </w:rPr>
     </w:lvl>
   </w:abstractNum>
-  <w:abstractNum w:abstractNumId="31" w15:restartNumberingAfterBreak="0">
+  <w:abstractNum w:abstractNumId="32" w15:restartNumberingAfterBreak="0">
     <w:nsid w:val="44EC47F5"/>
     <w:multiLevelType w:val="multilevel"/>
     <w:tmpl w:val="829C0720"/>
@@ -6718,7 +7419,7 @@
       </w:rPr>
     </w:lvl>
   </w:abstractNum>
-  <w:abstractNum w:abstractNumId="32" w15:restartNumberingAfterBreak="0">
+  <w:abstractNum w:abstractNumId="33" w15:restartNumberingAfterBreak="0">
     <w:nsid w:val="46D6381D"/>
     <w:multiLevelType w:val="multilevel"/>
     <w:tmpl w:val="C7F24708"/>
@@ -6867,7 +7568,7 @@
       </w:rPr>
     </w:lvl>
   </w:abstractNum>
-  <w:abstractNum w:abstractNumId="33" w15:restartNumberingAfterBreak="0">
+  <w:abstractNum w:abstractNumId="34" w15:restartNumberingAfterBreak="0">
     <w:nsid w:val="47A54D7F"/>
     <w:multiLevelType w:val="hybridMultilevel"/>
     <w:tmpl w:val="8B9ED28C"/>
@@ -6980,7 +7681,7 @@
       </w:rPr>
     </w:lvl>
   </w:abstractNum>
-  <w:abstractNum w:abstractNumId="34" w15:restartNumberingAfterBreak="0">
+  <w:abstractNum w:abstractNumId="35" w15:restartNumberingAfterBreak="0">
     <w:nsid w:val="498D6FD1"/>
     <w:multiLevelType w:val="multilevel"/>
     <w:tmpl w:val="0E74BB84"/>
@@ -7129,7 +7830,7 @@
       </w:rPr>
     </w:lvl>
   </w:abstractNum>
-  <w:abstractNum w:abstractNumId="35" w15:restartNumberingAfterBreak="0">
+  <w:abstractNum w:abstractNumId="36" w15:restartNumberingAfterBreak="0">
     <w:nsid w:val="4A241E0E"/>
     <w:multiLevelType w:val="multilevel"/>
     <w:tmpl w:val="7D6C35C2"/>
@@ -7278,7 +7979,7 @@
       </w:rPr>
     </w:lvl>
   </w:abstractNum>
-  <w:abstractNum w:abstractNumId="36" w15:restartNumberingAfterBreak="0">
+  <w:abstractNum w:abstractNumId="37" w15:restartNumberingAfterBreak="0">
     <w:nsid w:val="4AA42CDA"/>
     <w:multiLevelType w:val="multilevel"/>
     <w:tmpl w:val="A7B20ACA"/>
@@ -7427,7 +8128,7 @@
       </w:rPr>
     </w:lvl>
   </w:abstractNum>
-  <w:abstractNum w:abstractNumId="37" w15:restartNumberingAfterBreak="0">
+  <w:abstractNum w:abstractNumId="38" w15:restartNumberingAfterBreak="0">
     <w:nsid w:val="4AE159A9"/>
     <w:multiLevelType w:val="multilevel"/>
     <w:tmpl w:val="E5D49068"/>
@@ -7576,7 +8277,7 @@
       </w:rPr>
     </w:lvl>
   </w:abstractNum>
-  <w:abstractNum w:abstractNumId="38" w15:restartNumberingAfterBreak="0">
+  <w:abstractNum w:abstractNumId="39" w15:restartNumberingAfterBreak="0">
     <w:nsid w:val="4BE13ACD"/>
     <w:multiLevelType w:val="multilevel"/>
     <w:tmpl w:val="2B5A7F90"/>
@@ -7725,7 +8426,7 @@
       </w:rPr>
     </w:lvl>
   </w:abstractNum>
-  <w:abstractNum w:abstractNumId="39" w15:restartNumberingAfterBreak="0">
+  <w:abstractNum w:abstractNumId="40" w15:restartNumberingAfterBreak="0">
     <w:nsid w:val="4C383703"/>
     <w:multiLevelType w:val="multilevel"/>
     <w:tmpl w:val="4B3C8982"/>
@@ -7838,7 +8539,7 @@
       </w:pPr>
     </w:lvl>
   </w:abstractNum>
-  <w:abstractNum w:abstractNumId="40" w15:restartNumberingAfterBreak="0">
+  <w:abstractNum w:abstractNumId="41" w15:restartNumberingAfterBreak="0">
     <w:nsid w:val="4C412033"/>
     <w:multiLevelType w:val="hybridMultilevel"/>
     <w:tmpl w:val="DB70EE5A"/>
@@ -7951,7 +8652,7 @@
       </w:rPr>
     </w:lvl>
   </w:abstractNum>
-  <w:abstractNum w:abstractNumId="41" w15:restartNumberingAfterBreak="0">
+  <w:abstractNum w:abstractNumId="42" w15:restartNumberingAfterBreak="0">
     <w:nsid w:val="4CCE4F2E"/>
     <w:multiLevelType w:val="multilevel"/>
     <w:tmpl w:val="A03476DE"/>
@@ -8064,7 +8765,7 @@
       </w:pPr>
     </w:lvl>
   </w:abstractNum>
-  <w:abstractNum w:abstractNumId="42" w15:restartNumberingAfterBreak="0">
+  <w:abstractNum w:abstractNumId="43" w15:restartNumberingAfterBreak="0">
     <w:nsid w:val="4F040A7D"/>
     <w:multiLevelType w:val="multilevel"/>
     <w:tmpl w:val="31C0F062"/>
@@ -8213,7 +8914,7 @@
       </w:rPr>
     </w:lvl>
   </w:abstractNum>
-  <w:abstractNum w:abstractNumId="43" w15:restartNumberingAfterBreak="0">
+  <w:abstractNum w:abstractNumId="44" w15:restartNumberingAfterBreak="0">
     <w:nsid w:val="4F3D2CA2"/>
     <w:multiLevelType w:val="hybridMultilevel"/>
     <w:tmpl w:val="FD8C7206"/>
@@ -8326,7 +9027,7 @@
       </w:rPr>
     </w:lvl>
   </w:abstractNum>
-  <w:abstractNum w:abstractNumId="44" w15:restartNumberingAfterBreak="0">
+  <w:abstractNum w:abstractNumId="45" w15:restartNumberingAfterBreak="0">
     <w:nsid w:val="4FD31F31"/>
     <w:multiLevelType w:val="hybridMultilevel"/>
     <w:tmpl w:val="BB38DCA6"/>
@@ -8439,7 +9140,7 @@
       </w:rPr>
     </w:lvl>
   </w:abstractNum>
-  <w:abstractNum w:abstractNumId="45" w15:restartNumberingAfterBreak="0">
+  <w:abstractNum w:abstractNumId="46" w15:restartNumberingAfterBreak="0">
     <w:nsid w:val="508708D3"/>
     <w:multiLevelType w:val="multilevel"/>
     <w:tmpl w:val="6F3CCE0C"/>
@@ -8588,7 +9289,7 @@
       </w:rPr>
     </w:lvl>
   </w:abstractNum>
-  <w:abstractNum w:abstractNumId="46" w15:restartNumberingAfterBreak="0">
+  <w:abstractNum w:abstractNumId="47" w15:restartNumberingAfterBreak="0">
     <w:nsid w:val="52183AFF"/>
     <w:multiLevelType w:val="hybridMultilevel"/>
     <w:tmpl w:val="0ADA9DB6"/>
@@ -8701,7 +9402,7 @@
       </w:rPr>
     </w:lvl>
   </w:abstractNum>
-  <w:abstractNum w:abstractNumId="47" w15:restartNumberingAfterBreak="0">
+  <w:abstractNum w:abstractNumId="48" w15:restartNumberingAfterBreak="0">
     <w:nsid w:val="53047526"/>
     <w:multiLevelType w:val="multilevel"/>
     <w:tmpl w:val="249CF768"/>
@@ -8814,7 +9515,7 @@
       </w:pPr>
     </w:lvl>
   </w:abstractNum>
-  <w:abstractNum w:abstractNumId="48" w15:restartNumberingAfterBreak="0">
+  <w:abstractNum w:abstractNumId="49" w15:restartNumberingAfterBreak="0">
     <w:nsid w:val="53F47FE5"/>
     <w:multiLevelType w:val="hybridMultilevel"/>
     <w:tmpl w:val="A112D570"/>
@@ -8927,7 +9628,7 @@
       </w:rPr>
     </w:lvl>
   </w:abstractNum>
-  <w:abstractNum w:abstractNumId="49" w15:restartNumberingAfterBreak="0">
+  <w:abstractNum w:abstractNumId="50" w15:restartNumberingAfterBreak="0">
     <w:nsid w:val="55F27109"/>
     <w:multiLevelType w:val="hybridMultilevel"/>
     <w:tmpl w:val="5A82BE14"/>
@@ -9040,7 +9741,7 @@
       </w:rPr>
     </w:lvl>
   </w:abstractNum>
-  <w:abstractNum w:abstractNumId="50" w15:restartNumberingAfterBreak="0">
+  <w:abstractNum w:abstractNumId="51" w15:restartNumberingAfterBreak="0">
     <w:nsid w:val="5A5B263A"/>
     <w:multiLevelType w:val="hybridMultilevel"/>
     <w:tmpl w:val="54BE6842"/>
@@ -9153,7 +9854,7 @@
       </w:rPr>
     </w:lvl>
   </w:abstractNum>
-  <w:abstractNum w:abstractNumId="51" w15:restartNumberingAfterBreak="0">
+  <w:abstractNum w:abstractNumId="52" w15:restartNumberingAfterBreak="0">
     <w:nsid w:val="5AD31EE2"/>
     <w:multiLevelType w:val="hybridMultilevel"/>
     <w:tmpl w:val="F7F63DB8"/>
@@ -9266,7 +9967,7 @@
       </w:rPr>
     </w:lvl>
   </w:abstractNum>
-  <w:abstractNum w:abstractNumId="52" w15:restartNumberingAfterBreak="0">
+  <w:abstractNum w:abstractNumId="53" w15:restartNumberingAfterBreak="0">
     <w:nsid w:val="5B60478D"/>
     <w:multiLevelType w:val="multilevel"/>
     <w:tmpl w:val="567093B2"/>
@@ -9415,7 +10116,7 @@
       </w:rPr>
     </w:lvl>
   </w:abstractNum>
-  <w:abstractNum w:abstractNumId="53" w15:restartNumberingAfterBreak="0">
+  <w:abstractNum w:abstractNumId="54" w15:restartNumberingAfterBreak="0">
     <w:nsid w:val="5C5B4F43"/>
     <w:multiLevelType w:val="hybridMultilevel"/>
     <w:tmpl w:val="EAE86502"/>
@@ -9528,7 +10229,7 @@
       </w:rPr>
     </w:lvl>
   </w:abstractNum>
-  <w:abstractNum w:abstractNumId="54" w15:restartNumberingAfterBreak="0">
+  <w:abstractNum w:abstractNumId="55" w15:restartNumberingAfterBreak="0">
     <w:nsid w:val="60C53DDA"/>
     <w:multiLevelType w:val="multilevel"/>
     <w:tmpl w:val="1FDA4FA2"/>
@@ -9677,7 +10378,7 @@
       </w:rPr>
     </w:lvl>
   </w:abstractNum>
-  <w:abstractNum w:abstractNumId="55" w15:restartNumberingAfterBreak="0">
+  <w:abstractNum w:abstractNumId="56" w15:restartNumberingAfterBreak="0">
     <w:nsid w:val="610D7877"/>
     <w:multiLevelType w:val="multilevel"/>
     <w:tmpl w:val="9C84F68E"/>
@@ -9826,7 +10527,7 @@
       </w:rPr>
     </w:lvl>
   </w:abstractNum>
-  <w:abstractNum w:abstractNumId="56" w15:restartNumberingAfterBreak="0">
+  <w:abstractNum w:abstractNumId="57" w15:restartNumberingAfterBreak="0">
     <w:nsid w:val="625C2EEB"/>
     <w:multiLevelType w:val="hybridMultilevel"/>
     <w:tmpl w:val="70644F54"/>
@@ -9939,7 +10640,7 @@
       </w:rPr>
     </w:lvl>
   </w:abstractNum>
-  <w:abstractNum w:abstractNumId="57" w15:restartNumberingAfterBreak="0">
+  <w:abstractNum w:abstractNumId="58" w15:restartNumberingAfterBreak="0">
     <w:nsid w:val="664C2E73"/>
     <w:multiLevelType w:val="multilevel"/>
     <w:tmpl w:val="79AA0BEE"/>
@@ -10088,7 +10789,7 @@
       </w:rPr>
     </w:lvl>
   </w:abstractNum>
-  <w:abstractNum w:abstractNumId="58" w15:restartNumberingAfterBreak="0">
+  <w:abstractNum w:abstractNumId="59" w15:restartNumberingAfterBreak="0">
     <w:nsid w:val="66B7470A"/>
     <w:multiLevelType w:val="multilevel"/>
     <w:tmpl w:val="F73C5756"/>
@@ -10237,7 +10938,7 @@
       </w:rPr>
     </w:lvl>
   </w:abstractNum>
-  <w:abstractNum w:abstractNumId="59" w15:restartNumberingAfterBreak="0">
+  <w:abstractNum w:abstractNumId="60" w15:restartNumberingAfterBreak="0">
     <w:nsid w:val="68B23E9A"/>
     <w:multiLevelType w:val="hybridMultilevel"/>
     <w:tmpl w:val="D27EAFC2"/>
@@ -10350,7 +11051,7 @@
       </w:rPr>
     </w:lvl>
   </w:abstractNum>
-  <w:abstractNum w:abstractNumId="60" w15:restartNumberingAfterBreak="0">
+  <w:abstractNum w:abstractNumId="61" w15:restartNumberingAfterBreak="0">
     <w:nsid w:val="6933095A"/>
     <w:multiLevelType w:val="hybridMultilevel"/>
     <w:tmpl w:val="855ED062"/>
@@ -10463,7 +11164,7 @@
       </w:rPr>
     </w:lvl>
   </w:abstractNum>
-  <w:abstractNum w:abstractNumId="61" w15:restartNumberingAfterBreak="0">
+  <w:abstractNum w:abstractNumId="62" w15:restartNumberingAfterBreak="0">
     <w:nsid w:val="6B920C60"/>
     <w:multiLevelType w:val="multilevel"/>
     <w:tmpl w:val="FD4628CE"/>
@@ -10612,7 +11313,7 @@
       </w:rPr>
     </w:lvl>
   </w:abstractNum>
-  <w:abstractNum w:abstractNumId="62" w15:restartNumberingAfterBreak="0">
+  <w:abstractNum w:abstractNumId="63" w15:restartNumberingAfterBreak="0">
     <w:nsid w:val="6BA5682F"/>
     <w:multiLevelType w:val="multilevel"/>
     <w:tmpl w:val="4DE842A0"/>
@@ -10761,7 +11462,7 @@
       </w:rPr>
     </w:lvl>
   </w:abstractNum>
-  <w:abstractNum w:abstractNumId="63" w15:restartNumberingAfterBreak="0">
+  <w:abstractNum w:abstractNumId="64" w15:restartNumberingAfterBreak="0">
     <w:nsid w:val="6FD1747E"/>
     <w:multiLevelType w:val="hybridMultilevel"/>
     <w:tmpl w:val="8E5E2D80"/>
@@ -10874,7 +11575,7 @@
       </w:rPr>
     </w:lvl>
   </w:abstractNum>
-  <w:abstractNum w:abstractNumId="64" w15:restartNumberingAfterBreak="0">
+  <w:abstractNum w:abstractNumId="65" w15:restartNumberingAfterBreak="0">
     <w:nsid w:val="73100B9D"/>
     <w:multiLevelType w:val="hybridMultilevel"/>
     <w:tmpl w:val="666A7DAE"/>
@@ -10987,7 +11688,7 @@
       </w:rPr>
     </w:lvl>
   </w:abstractNum>
-  <w:abstractNum w:abstractNumId="65" w15:restartNumberingAfterBreak="0">
+  <w:abstractNum w:abstractNumId="66" w15:restartNumberingAfterBreak="0">
     <w:nsid w:val="77EF551B"/>
     <w:multiLevelType w:val="hybridMultilevel"/>
     <w:tmpl w:val="47A4E72A"/>
@@ -11100,7 +11801,7 @@
       </w:rPr>
     </w:lvl>
   </w:abstractNum>
-  <w:abstractNum w:abstractNumId="66" w15:restartNumberingAfterBreak="0">
+  <w:abstractNum w:abstractNumId="67" w15:restartNumberingAfterBreak="0">
     <w:nsid w:val="7A3107AD"/>
     <w:multiLevelType w:val="multilevel"/>
     <w:tmpl w:val="2AE63E0A"/>
@@ -11217,7 +11918,7 @@
       </w:pPr>
     </w:lvl>
   </w:abstractNum>
-  <w:abstractNum w:abstractNumId="67" w15:restartNumberingAfterBreak="0">
+  <w:abstractNum w:abstractNumId="68" w15:restartNumberingAfterBreak="0">
     <w:nsid w:val="7C8958DF"/>
     <w:multiLevelType w:val="multilevel"/>
     <w:tmpl w:val="3384DD7C"/>
@@ -11330,47 +12031,196 @@
       </w:pPr>
     </w:lvl>
   </w:abstractNum>
+  <w:abstractNum w:abstractNumId="69" w15:restartNumberingAfterBreak="0">
+    <w:nsid w:val="7D015B26"/>
+    <w:multiLevelType w:val="multilevel"/>
+    <w:tmpl w:val="0716380E"/>
+    <w:lvl w:ilvl="0">
+      <w:start w:val="1"/>
+      <w:numFmt w:val="bullet"/>
+      <w:lvlText w:val=""/>
+      <w:lvlJc w:val="left"/>
+      <w:pPr>
+        <w:tabs>
+          <w:tab w:val="num" w:pos="720"/>
+        </w:tabs>
+        <w:ind w:left="720" w:hanging="360"/>
+      </w:pPr>
+      <w:rPr>
+        <w:rFonts w:ascii="Symbol" w:hAnsi="Symbol" w:hint="default"/>
+        <w:sz w:val="20"/>
+      </w:rPr>
+    </w:lvl>
+    <w:lvl w:ilvl="1" w:tentative="1">
+      <w:start w:val="1"/>
+      <w:numFmt w:val="bullet"/>
+      <w:lvlText w:val="o"/>
+      <w:lvlJc w:val="left"/>
+      <w:pPr>
+        <w:tabs>
+          <w:tab w:val="num" w:pos="1440"/>
+        </w:tabs>
+        <w:ind w:left="1440" w:hanging="360"/>
+      </w:pPr>
+      <w:rPr>
+        <w:rFonts w:ascii="Courier New" w:hAnsi="Courier New" w:hint="default"/>
+        <w:sz w:val="20"/>
+      </w:rPr>
+    </w:lvl>
+    <w:lvl w:ilvl="2" w:tentative="1">
+      <w:start w:val="1"/>
+      <w:numFmt w:val="bullet"/>
+      <w:lvlText w:val=""/>
+      <w:lvlJc w:val="left"/>
+      <w:pPr>
+        <w:tabs>
+          <w:tab w:val="num" w:pos="2160"/>
+        </w:tabs>
+        <w:ind w:left="2160" w:hanging="360"/>
+      </w:pPr>
+      <w:rPr>
+        <w:rFonts w:ascii="Wingdings" w:hAnsi="Wingdings" w:hint="default"/>
+        <w:sz w:val="20"/>
+      </w:rPr>
+    </w:lvl>
+    <w:lvl w:ilvl="3" w:tentative="1">
+      <w:start w:val="1"/>
+      <w:numFmt w:val="bullet"/>
+      <w:lvlText w:val=""/>
+      <w:lvlJc w:val="left"/>
+      <w:pPr>
+        <w:tabs>
+          <w:tab w:val="num" w:pos="2880"/>
+        </w:tabs>
+        <w:ind w:left="2880" w:hanging="360"/>
+      </w:pPr>
+      <w:rPr>
+        <w:rFonts w:ascii="Wingdings" w:hAnsi="Wingdings" w:hint="default"/>
+        <w:sz w:val="20"/>
+      </w:rPr>
+    </w:lvl>
+    <w:lvl w:ilvl="4" w:tentative="1">
+      <w:start w:val="1"/>
+      <w:numFmt w:val="bullet"/>
+      <w:lvlText w:val=""/>
+      <w:lvlJc w:val="left"/>
+      <w:pPr>
+        <w:tabs>
+          <w:tab w:val="num" w:pos="3600"/>
+        </w:tabs>
+        <w:ind w:left="3600" w:hanging="360"/>
+      </w:pPr>
+      <w:rPr>
+        <w:rFonts w:ascii="Wingdings" w:hAnsi="Wingdings" w:hint="default"/>
+        <w:sz w:val="20"/>
+      </w:rPr>
+    </w:lvl>
+    <w:lvl w:ilvl="5" w:tentative="1">
+      <w:start w:val="1"/>
+      <w:numFmt w:val="bullet"/>
+      <w:lvlText w:val=""/>
+      <w:lvlJc w:val="left"/>
+      <w:pPr>
+        <w:tabs>
+          <w:tab w:val="num" w:pos="4320"/>
+        </w:tabs>
+        <w:ind w:left="4320" w:hanging="360"/>
+      </w:pPr>
+      <w:rPr>
+        <w:rFonts w:ascii="Wingdings" w:hAnsi="Wingdings" w:hint="default"/>
+        <w:sz w:val="20"/>
+      </w:rPr>
+    </w:lvl>
+    <w:lvl w:ilvl="6" w:tentative="1">
+      <w:start w:val="1"/>
+      <w:numFmt w:val="bullet"/>
+      <w:lvlText w:val=""/>
+      <w:lvlJc w:val="left"/>
+      <w:pPr>
+        <w:tabs>
+          <w:tab w:val="num" w:pos="5040"/>
+        </w:tabs>
+        <w:ind w:left="5040" w:hanging="360"/>
+      </w:pPr>
+      <w:rPr>
+        <w:rFonts w:ascii="Wingdings" w:hAnsi="Wingdings" w:hint="default"/>
+        <w:sz w:val="20"/>
+      </w:rPr>
+    </w:lvl>
+    <w:lvl w:ilvl="7" w:tentative="1">
+      <w:start w:val="1"/>
+      <w:numFmt w:val="bullet"/>
+      <w:lvlText w:val=""/>
+      <w:lvlJc w:val="left"/>
+      <w:pPr>
+        <w:tabs>
+          <w:tab w:val="num" w:pos="5760"/>
+        </w:tabs>
+        <w:ind w:left="5760" w:hanging="360"/>
+      </w:pPr>
+      <w:rPr>
+        <w:rFonts w:ascii="Wingdings" w:hAnsi="Wingdings" w:hint="default"/>
+        <w:sz w:val="20"/>
+      </w:rPr>
+    </w:lvl>
+    <w:lvl w:ilvl="8" w:tentative="1">
+      <w:start w:val="1"/>
+      <w:numFmt w:val="bullet"/>
+      <w:lvlText w:val=""/>
+      <w:lvlJc w:val="left"/>
+      <w:pPr>
+        <w:tabs>
+          <w:tab w:val="num" w:pos="6480"/>
+        </w:tabs>
+        <w:ind w:left="6480" w:hanging="360"/>
+      </w:pPr>
+      <w:rPr>
+        <w:rFonts w:ascii="Wingdings" w:hAnsi="Wingdings" w:hint="default"/>
+        <w:sz w:val="20"/>
+      </w:rPr>
+    </w:lvl>
+  </w:abstractNum>
   <w:num w:numId="1" w16cid:durableId="1763724094">
-    <w:abstractNumId w:val="40"/>
+    <w:abstractNumId w:val="41"/>
   </w:num>
   <w:num w:numId="2" w16cid:durableId="961961015">
-    <w:abstractNumId w:val="60"/>
+    <w:abstractNumId w:val="61"/>
   </w:num>
   <w:num w:numId="3" w16cid:durableId="1784030911">
-    <w:abstractNumId w:val="12"/>
+    <w:abstractNumId w:val="13"/>
   </w:num>
   <w:num w:numId="4" w16cid:durableId="1804157765">
-    <w:abstractNumId w:val="65"/>
+    <w:abstractNumId w:val="66"/>
   </w:num>
   <w:num w:numId="5" w16cid:durableId="591283730">
-    <w:abstractNumId w:val="51"/>
+    <w:abstractNumId w:val="52"/>
   </w:num>
   <w:num w:numId="6" w16cid:durableId="820927104">
-    <w:abstractNumId w:val="17"/>
+    <w:abstractNumId w:val="18"/>
   </w:num>
   <w:num w:numId="7" w16cid:durableId="1772779097">
     <w:abstractNumId w:val="4"/>
   </w:num>
   <w:num w:numId="8" w16cid:durableId="1053315342">
-    <w:abstractNumId w:val="50"/>
+    <w:abstractNumId w:val="51"/>
   </w:num>
   <w:num w:numId="9" w16cid:durableId="855920542">
-    <w:abstractNumId w:val="24"/>
+    <w:abstractNumId w:val="25"/>
   </w:num>
   <w:num w:numId="10" w16cid:durableId="1268663009">
-    <w:abstractNumId w:val="63"/>
+    <w:abstractNumId w:val="64"/>
   </w:num>
   <w:num w:numId="11" w16cid:durableId="711342348">
-    <w:abstractNumId w:val="46"/>
+    <w:abstractNumId w:val="47"/>
   </w:num>
   <w:num w:numId="12" w16cid:durableId="1371495341">
-    <w:abstractNumId w:val="44"/>
+    <w:abstractNumId w:val="45"/>
   </w:num>
   <w:num w:numId="13" w16cid:durableId="597103253">
     <w:abstractNumId w:val="1"/>
   </w:num>
   <w:num w:numId="14" w16cid:durableId="1786119784">
-    <w:abstractNumId w:val="58"/>
+    <w:abstractNumId w:val="59"/>
   </w:num>
   <w:num w:numId="15" w16cid:durableId="1299994431">
     <w:abstractNumId w:val="3"/>
@@ -11379,190 +12229,190 @@
     <w:abstractNumId w:val="9"/>
   </w:num>
   <w:num w:numId="17" w16cid:durableId="1206596425">
-    <w:abstractNumId w:val="22"/>
+    <w:abstractNumId w:val="23"/>
   </w:num>
   <w:num w:numId="18" w16cid:durableId="685906010">
-    <w:abstractNumId w:val="26"/>
+    <w:abstractNumId w:val="27"/>
   </w:num>
   <w:num w:numId="19" w16cid:durableId="1293755502">
-    <w:abstractNumId w:val="52"/>
+    <w:abstractNumId w:val="53"/>
   </w:num>
   <w:num w:numId="20" w16cid:durableId="707728446">
-    <w:abstractNumId w:val="36"/>
+    <w:abstractNumId w:val="37"/>
   </w:num>
   <w:num w:numId="21" w16cid:durableId="588581874">
-    <w:abstractNumId w:val="19"/>
+    <w:abstractNumId w:val="20"/>
   </w:num>
   <w:num w:numId="22" w16cid:durableId="315302723">
-    <w:abstractNumId w:val="57"/>
+    <w:abstractNumId w:val="58"/>
   </w:num>
   <w:num w:numId="23" w16cid:durableId="505676591">
-    <w:abstractNumId w:val="33"/>
+    <w:abstractNumId w:val="34"/>
   </w:num>
   <w:num w:numId="24" w16cid:durableId="1881277792">
-    <w:abstractNumId w:val="59"/>
+    <w:abstractNumId w:val="60"/>
   </w:num>
   <w:num w:numId="25" w16cid:durableId="1653633410">
-    <w:abstractNumId w:val="49"/>
+    <w:abstractNumId w:val="50"/>
   </w:num>
   <w:num w:numId="26" w16cid:durableId="269973828">
     <w:abstractNumId w:val="2"/>
   </w:num>
   <w:num w:numId="27" w16cid:durableId="760834143">
-    <w:abstractNumId w:val="18"/>
+    <w:abstractNumId w:val="19"/>
   </w:num>
   <w:num w:numId="28" w16cid:durableId="1618950398">
-    <w:abstractNumId w:val="39"/>
+    <w:abstractNumId w:val="40"/>
   </w:num>
   <w:num w:numId="29" w16cid:durableId="1460421090">
-    <w:abstractNumId w:val="14"/>
+    <w:abstractNumId w:val="15"/>
   </w:num>
   <w:num w:numId="30" w16cid:durableId="907768863">
+    <w:abstractNumId w:val="22"/>
+  </w:num>
+  <w:num w:numId="31" w16cid:durableId="708382410">
+    <w:abstractNumId w:val="63"/>
+  </w:num>
+  <w:num w:numId="32" w16cid:durableId="1000932444">
     <w:abstractNumId w:val="21"/>
   </w:num>
-  <w:num w:numId="31" w16cid:durableId="708382410">
-    <w:abstractNumId w:val="62"/>
-  </w:num>
-  <w:num w:numId="32" w16cid:durableId="1000932444">
-    <w:abstractNumId w:val="20"/>
-  </w:num>
   <w:num w:numId="33" w16cid:durableId="428818876">
-    <w:abstractNumId w:val="29"/>
+    <w:abstractNumId w:val="30"/>
   </w:num>
   <w:num w:numId="34" w16cid:durableId="1016351605">
-    <w:abstractNumId w:val="67"/>
+    <w:abstractNumId w:val="68"/>
   </w:num>
   <w:num w:numId="35" w16cid:durableId="1072855570">
-    <w:abstractNumId w:val="56"/>
+    <w:abstractNumId w:val="57"/>
   </w:num>
   <w:num w:numId="36" w16cid:durableId="341932746">
-    <w:abstractNumId w:val="64"/>
+    <w:abstractNumId w:val="65"/>
   </w:num>
   <w:num w:numId="37" w16cid:durableId="1672678791">
     <w:abstractNumId w:val="10"/>
   </w:num>
   <w:num w:numId="38" w16cid:durableId="463349419">
-    <w:abstractNumId w:val="38"/>
+    <w:abstractNumId w:val="39"/>
     <w:lvlOverride w:ilvl="0">
       <w:startOverride w:val="1"/>
     </w:lvlOverride>
   </w:num>
   <w:num w:numId="39" w16cid:durableId="1648784051">
-    <w:abstractNumId w:val="38"/>
+    <w:abstractNumId w:val="39"/>
     <w:lvlOverride w:ilvl="0">
       <w:startOverride w:val="2"/>
     </w:lvlOverride>
   </w:num>
   <w:num w:numId="40" w16cid:durableId="185363691">
-    <w:abstractNumId w:val="38"/>
+    <w:abstractNumId w:val="39"/>
     <w:lvlOverride w:ilvl="0">
       <w:startOverride w:val="3"/>
     </w:lvlOverride>
   </w:num>
   <w:num w:numId="41" w16cid:durableId="1246646369">
-    <w:abstractNumId w:val="38"/>
+    <w:abstractNumId w:val="39"/>
     <w:lvlOverride w:ilvl="0">
       <w:startOverride w:val="4"/>
     </w:lvlOverride>
   </w:num>
   <w:num w:numId="42" w16cid:durableId="797144736">
-    <w:abstractNumId w:val="47"/>
+    <w:abstractNumId w:val="48"/>
     <w:lvlOverride w:ilvl="0">
       <w:startOverride w:val="1"/>
     </w:lvlOverride>
   </w:num>
   <w:num w:numId="43" w16cid:durableId="2140537943">
-    <w:abstractNumId w:val="47"/>
+    <w:abstractNumId w:val="48"/>
     <w:lvlOverride w:ilvl="0">
       <w:startOverride w:val="2"/>
     </w:lvlOverride>
   </w:num>
   <w:num w:numId="44" w16cid:durableId="839732354">
-    <w:abstractNumId w:val="47"/>
+    <w:abstractNumId w:val="48"/>
     <w:lvlOverride w:ilvl="0">
       <w:startOverride w:val="3"/>
     </w:lvlOverride>
   </w:num>
   <w:num w:numId="45" w16cid:durableId="1391880738">
-    <w:abstractNumId w:val="45"/>
+    <w:abstractNumId w:val="46"/>
     <w:lvlOverride w:ilvl="0">
       <w:startOverride w:val="1"/>
     </w:lvlOverride>
   </w:num>
   <w:num w:numId="46" w16cid:durableId="2059432875">
-    <w:abstractNumId w:val="45"/>
+    <w:abstractNumId w:val="46"/>
     <w:lvlOverride w:ilvl="0">
       <w:startOverride w:val="2"/>
     </w:lvlOverride>
   </w:num>
   <w:num w:numId="47" w16cid:durableId="1291135740">
-    <w:abstractNumId w:val="45"/>
+    <w:abstractNumId w:val="46"/>
     <w:lvlOverride w:ilvl="0">
       <w:startOverride w:val="3"/>
     </w:lvlOverride>
   </w:num>
   <w:num w:numId="48" w16cid:durableId="901867052">
-    <w:abstractNumId w:val="45"/>
+    <w:abstractNumId w:val="46"/>
     <w:lvlOverride w:ilvl="0">
       <w:startOverride w:val="4"/>
     </w:lvlOverride>
   </w:num>
   <w:num w:numId="49" w16cid:durableId="539169478">
-    <w:abstractNumId w:val="45"/>
+    <w:abstractNumId w:val="46"/>
     <w:lvlOverride w:ilvl="0">
       <w:startOverride w:val="5"/>
     </w:lvlOverride>
   </w:num>
   <w:num w:numId="50" w16cid:durableId="1714191460">
-    <w:abstractNumId w:val="48"/>
+    <w:abstractNumId w:val="49"/>
   </w:num>
   <w:num w:numId="51" w16cid:durableId="346442378">
-    <w:abstractNumId w:val="34"/>
+    <w:abstractNumId w:val="35"/>
   </w:num>
   <w:num w:numId="52" w16cid:durableId="1693148979">
-    <w:abstractNumId w:val="25"/>
+    <w:abstractNumId w:val="26"/>
   </w:num>
   <w:num w:numId="53" w16cid:durableId="1833443079">
-    <w:abstractNumId w:val="61"/>
+    <w:abstractNumId w:val="62"/>
   </w:num>
   <w:num w:numId="54" w16cid:durableId="1414007717">
-    <w:abstractNumId w:val="42"/>
+    <w:abstractNumId w:val="43"/>
   </w:num>
   <w:num w:numId="55" w16cid:durableId="999579083">
-    <w:abstractNumId w:val="66"/>
+    <w:abstractNumId w:val="67"/>
   </w:num>
   <w:num w:numId="56" w16cid:durableId="412629885">
-    <w:abstractNumId w:val="53"/>
+    <w:abstractNumId w:val="54"/>
   </w:num>
   <w:num w:numId="57" w16cid:durableId="684750205">
+    <w:abstractNumId w:val="56"/>
+  </w:num>
+  <w:num w:numId="58" w16cid:durableId="408773498">
+    <w:abstractNumId w:val="12"/>
+  </w:num>
+  <w:num w:numId="59" w16cid:durableId="1663849970">
+    <w:abstractNumId w:val="36"/>
+  </w:num>
+  <w:num w:numId="60" w16cid:durableId="1181628146">
     <w:abstractNumId w:val="55"/>
   </w:num>
-  <w:num w:numId="58" w16cid:durableId="408773498">
-    <w:abstractNumId w:val="11"/>
-  </w:num>
-  <w:num w:numId="59" w16cid:durableId="1663849970">
-    <w:abstractNumId w:val="35"/>
-  </w:num>
-  <w:num w:numId="60" w16cid:durableId="1181628146">
-    <w:abstractNumId w:val="54"/>
-  </w:num>
   <w:num w:numId="61" w16cid:durableId="2085686014">
-    <w:abstractNumId w:val="30"/>
+    <w:abstractNumId w:val="31"/>
   </w:num>
   <w:num w:numId="62" w16cid:durableId="1313870506">
     <w:abstractNumId w:val="8"/>
   </w:num>
   <w:num w:numId="63" w16cid:durableId="743140814">
-    <w:abstractNumId w:val="43"/>
+    <w:abstractNumId w:val="44"/>
   </w:num>
   <w:num w:numId="64" w16cid:durableId="1628008152">
-    <w:abstractNumId w:val="16"/>
+    <w:abstractNumId w:val="17"/>
   </w:num>
   <w:num w:numId="65" w16cid:durableId="1520660974">
-    <w:abstractNumId w:val="31"/>
+    <w:abstractNumId w:val="32"/>
   </w:num>
   <w:num w:numId="66" w16cid:durableId="1616592897">
-    <w:abstractNumId w:val="41"/>
+    <w:abstractNumId w:val="42"/>
   </w:num>
   <w:num w:numId="67" w16cid:durableId="1509633981">
     <w:abstractNumId w:val="6"/>
@@ -11571,31 +12421,37 @@
     <w:abstractNumId w:val="0"/>
   </w:num>
   <w:num w:numId="69" w16cid:durableId="501358131">
-    <w:abstractNumId w:val="28"/>
+    <w:abstractNumId w:val="29"/>
   </w:num>
   <w:num w:numId="70" w16cid:durableId="1852253759">
     <w:abstractNumId w:val="7"/>
   </w:num>
   <w:num w:numId="71" w16cid:durableId="997540121">
-    <w:abstractNumId w:val="37"/>
+    <w:abstractNumId w:val="38"/>
   </w:num>
   <w:num w:numId="72" w16cid:durableId="709307308">
-    <w:abstractNumId w:val="32"/>
+    <w:abstractNumId w:val="33"/>
   </w:num>
   <w:num w:numId="73" w16cid:durableId="74400418">
-    <w:abstractNumId w:val="27"/>
+    <w:abstractNumId w:val="28"/>
   </w:num>
   <w:num w:numId="74" w16cid:durableId="1622496733">
-    <w:abstractNumId w:val="23"/>
+    <w:abstractNumId w:val="24"/>
   </w:num>
   <w:num w:numId="75" w16cid:durableId="735973965">
-    <w:abstractNumId w:val="15"/>
+    <w:abstractNumId w:val="16"/>
   </w:num>
   <w:num w:numId="76" w16cid:durableId="983196209">
     <w:abstractNumId w:val="5"/>
   </w:num>
   <w:num w:numId="77" w16cid:durableId="736172788">
-    <w:abstractNumId w:val="13"/>
+    <w:abstractNumId w:val="14"/>
+  </w:num>
+  <w:num w:numId="78" w16cid:durableId="1585186311">
+    <w:abstractNumId w:val="69"/>
+  </w:num>
+  <w:num w:numId="79" w16cid:durableId="945696450">
+    <w:abstractNumId w:val="11"/>
   </w:num>
 </w:numbering>
 </file>

</xml_diff>